<commit_message>
Paper 3 R7 and thesis V44: record the author's account of Stage-3 assistance (no supervision required; research assistant helped some older participants operate a tablet)
Co-Authored-By: Claude Fable 5.1 <noreply@anthropic.com>
Claude-Session: https://claude.ai/code/session_01KoT3i8geZspYBMMKVYJUTG
</commit_message>
<xml_diff>
--- a/docs/papers/paper3_submission/jmir_R7/Paper3_R7_JMIR_Manuscript_2026-09-27.docx
+++ b/docs/papers/paper3_submission/jmir_R7/Paper3_R7_JMIR_Manuscript_2026-09-27.docx
@@ -153,7 +153,7 @@
     </w:p>
     <w:p>
       <w:r>
-        <w:t>The March-April 2026 deployment was exploratory and observational. Reporting follows the STROBE (Strengthening the Reporting of Observational Studies in Epidemiology) checklist for cross-sectional studies, provided as Multimedia Appendix 1. The game was distributed through the authors' Hong Kong-based networks, with onward forwarding through personal contacts, work contacts, a charity community network, university support channels and medical-centre peers. Gameplay was offered away from the clinical FRA station. The extent of in-person facilitation is not established for individual sessions, so the deployment is not characterised as uniformly unsupervised. The earlier Stage-2 cohort [2] provides background only and was not a concurrent control group.</w:t>
+        <w:t>The March-April 2026 deployment was exploratory and observational. Reporting follows the STROBE (Strengthening the Reporting of Observational Studies in Epidemiology) checklist for cross-sectional studies, provided as Multimedia Appendix 1. The game was distributed through the authors' Hong Kong-based networks, with onward forwarding through personal contacts, work contacts, a charity community network, university support channels and medical-centre peers. Gameplay was offered away from the clinical FRA station. Supervision of play was not required, in contrast to the therapist-supervised Stage-2 sessions. The authors report that some older participants played on a tablet with a research assistant beside them to help operate the device, without playing on their behalf; the number of such sessions, the participants concerned and the devices used were not recorded, so assistance cannot be linked to individual records. The earlier Stage-2 cohort [2] provides background only and was not a concurrent control group.</w:t>
       </w:r>
     </w:p>
     <w:p>
@@ -202,7 +202,7 @@
     </w:p>
     <w:p>
       <w:r>
-        <w:t>The archived Stage-3 build is identified as Alpine_Coordination_Game_Stage3_v2.2.html, a 37,279-byte HTML file with SHA-256 prefix 42bc3df6; the archive identifies it as byte-identical to the _v2 file. Runs use a distance goal or a time cap: 200 m or 30 seconds, and 400 m or 60 seconds. The build's zero-failure mode does not slow the player following a bump. It supports keyboard arrows and a joystick or foot pad through the browser Gamepad API. The archived version lacks touch controls, although the reconstructed invitation mentions touchscreen play; a touch-capable version was first created in August 2026. Figure 1 illustrates the archived design at staged difficulty settings.</w:t>
+        <w:t>The archived Stage-3 build is identified as Alpine_Coordination_Game_Stage3_v2.2.html, a 37,279-byte HTML file with SHA-256 prefix 42bc3df6; the archive identifies it as byte-identical to the _v2 file. Runs use a distance goal or a time cap: 200 m or 30 seconds, and 400 m or 60 seconds. The build's zero-failure mode does not slow the player following a bump. It supports keyboard arrows and a joystick or foot pad through the browser Gamepad API. The archived version lacks touch controls, although the reconstructed invitation mentions touchscreen play and the authors report tablet-assisted sessions; a touch-capable version was first created in August 2026. Which input those tablet sessions used, or whether a different build reached them, has not been reconciled. Figure 1 illustrates the archived design at staged difficulty settings.</w:t>
       </w:r>
     </w:p>
     <w:p>
@@ -3060,7 +3060,7 @@
     </w:p>
     <w:p>
       <w:r>
-        <w:t>The respondent-only denominator limits generalisation beyond the 120 compiled records. Missing source-linked participant compilation, uncertain timing and undocumented applied classification rules limit the meaning of the primary outcomes. Questionnaire wording and coding require reconciliation. The reconstructed invitation and uncertainty about facilitation limit conclusions about participants' exposure to a particular framing. Version and input-device differences also need to be linked to individual records.</w:t>
+        <w:t>The respondent-only denominator limits generalisation beyond the 120 compiled records. Missing source-linked participant compilation, uncertain timing and undocumented applied classification rules limit the meaning of the primary outcomes. Questionnaire wording and coding require reconciliation. The reconstructed invitation and the unrecorded extent of research-assistant help with device operation limit conclusions about participants' exposure to a particular framing. Version and input-device differences also need to be linked to individual records.</w:t>
       </w:r>
     </w:p>
     <w:p>

</xml_diff>

<commit_message>
Paper 3 R7 and thesis V44: tablet-assisted Stage-3 sessions used a keyboard with the archived build (author, 27 Sep)
Co-Authored-By: Claude Fable 5.1 <noreply@anthropic.com>
Claude-Session: https://claude.ai/code/session_01KoT3i8geZspYBMMKVYJUTG
</commit_message>
<xml_diff>
--- a/docs/papers/paper3_submission/jmir_R7/Paper3_R7_JMIR_Manuscript_2026-09-27.docx
+++ b/docs/papers/paper3_submission/jmir_R7/Paper3_R7_JMIR_Manuscript_2026-09-27.docx
@@ -153,7 +153,7 @@
     </w:p>
     <w:p>
       <w:r>
-        <w:t>The March-April 2026 deployment was exploratory and observational. Reporting follows the STROBE (Strengthening the Reporting of Observational Studies in Epidemiology) checklist for cross-sectional studies, provided as Multimedia Appendix 1. The game was distributed through the authors' Hong Kong-based networks, with onward forwarding through personal contacts, work contacts, a charity community network, university support channels and medical-centre peers. Gameplay was offered away from the clinical FRA station. Supervision of play was not required, in contrast to the therapist-supervised Stage-2 sessions. The authors report that some older participants played on a tablet with a research assistant beside them to help operate the device, without playing on their behalf; the number of such sessions, the participants concerned and the devices used were not recorded, so assistance cannot be linked to individual records. The earlier Stage-2 cohort [2] provides background only and was not a concurrent control group.</w:t>
+        <w:t>The March-April 2026 deployment was exploratory and observational. Reporting follows the STROBE (Strengthening the Reporting of Observational Studies in Epidemiology) checklist for cross-sectional studies, provided as Multimedia Appendix 1. The game was distributed through the authors' Hong Kong-based networks, with onward forwarding through personal contacts, work contacts, a charity community network, university support channels and medical-centre peers. Gameplay was offered away from the clinical FRA station. Supervision of play was not required, in contrast to the therapist-supervised Stage-2 sessions. The authors report that some older participants played on a tablet with a research assistant beside them to help operate the device, without playing on their behalf; input was by keyboard in those sessions; the number of such sessions and the participants concerned were not recorded, so assistance cannot be linked to individual records. The earlier Stage-2 cohort [2] provides background only and was not a concurrent control group.</w:t>
       </w:r>
     </w:p>
     <w:p>
@@ -202,7 +202,7 @@
     </w:p>
     <w:p>
       <w:r>
-        <w:t>The archived Stage-3 build is identified as Alpine_Coordination_Game_Stage3_v2.2.html, a 37,279-byte HTML file with SHA-256 prefix 42bc3df6; the archive identifies it as byte-identical to the _v2 file. Runs use a distance goal or a time cap: 200 m or 30 seconds, and 400 m or 60 seconds. The build's zero-failure mode does not slow the player following a bump. It supports keyboard arrows and a joystick or foot pad through the browser Gamepad API. The archived version lacks touch controls, although the reconstructed invitation mentions touchscreen play and the authors report tablet-assisted sessions; a touch-capable version was first created in August 2026. Which input those tablet sessions used, or whether a different build reached them, has not been reconciled. Figure 1 illustrates the archived design at staged difficulty settings.</w:t>
+        <w:t>The archived Stage-3 build is identified as Alpine_Coordination_Game_Stage3_v2.2.html, a 37,279-byte HTML file with SHA-256 prefix 42bc3df6; the archive identifies it as byte-identical to the _v2 file. Runs use a distance goal or a time cap: 200 m or 30 seconds, and 400 m or 60 seconds. The build's zero-failure mode does not slow the player following a bump. It supports keyboard arrows and a joystick or foot pad through the browser Gamepad API. The archived version lacks touch controls; the authors report that tablet-assisted sessions used an external keyboard with this same build, and that the invitation's mention of touchscreen play did not correspond to a touch-capable version, which was first created in August 2026. Figure 1 illustrates the archived design at staged difficulty settings.</w:t>
       </w:r>
     </w:p>
     <w:p>

</xml_diff>

<commit_message>
Paper 3 R7 and thesis V45: author's account of Stage-3 distribution (research assistants, iPad with keyboard, control choice), FIAS as preferred reading, Stage-3B design rationale as future research
Co-Authored-By: Claude Fable 5.1 <noreply@anthropic.com>
Claude-Session: https://claude.ai/code/session_01KoT3i8geZspYBMMKVYJUTG
</commit_message>
<xml_diff>
--- a/docs/papers/paper3_submission/jmir_R7/Paper3_R7_JMIR_Manuscript_2026-09-27.docx
+++ b/docs/papers/paper3_submission/jmir_R7/Paper3_R7_JMIR_Manuscript_2026-09-27.docx
@@ -153,7 +153,7 @@
     </w:p>
     <w:p>
       <w:r>
-        <w:t>The March-April 2026 deployment was exploratory and observational. Reporting follows the STROBE (Strengthening the Reporting of Observational Studies in Epidemiology) checklist for cross-sectional studies, provided as Multimedia Appendix 1. The game was distributed through the authors' Hong Kong-based networks, with onward forwarding through personal contacts, work contacts, a charity community network, university support channels and medical-centre peers. Gameplay was offered away from the clinical FRA station. Supervision of play was not required, in contrast to the therapist-supervised Stage-2 sessions. The authors report that some older participants played on a tablet with a research assistant beside them to help operate the device, without playing on their behalf; input was by keyboard in those sessions; the number of such sessions and the participants concerned were not recorded, so assistance cannot be linked to individual records. The earlier Stage-2 cohort [2] provides background only and was not a concurrent control group.</w:t>
+        <w:t>The March-April 2026 deployment was exploratory and observational. Reporting follows the STROBE (Strengthening the Reporting of Observational Studies in Epidemiology) checklist for cross-sectional studies, provided as Multimedia Appendix 1. The game was distributed by research assistants recruited and briefed by the first author through the authors' Hong Kong-based networks, with onward forwarding through personal contacts, work contacts, a charity community network, university support channels and medical-centre peers; most participants received the HTML build by e-mail with a written introduction, while some older participants played on an iPad on which the build had been pre-installed, with an external keyboard. Gameplay was offered away from the clinical FRA station. Supervision of play was not required, in contrast to the therapist-supervised Stage-2 sessions. The authors report that in those iPad sessions a research assistant stayed beside the participant to help operate the device, without playing on their behalf; input was by keyboard; the number of such sessions and the participants concerned were not recorded, so assistance cannot be linked to individual records. The earlier Stage-2 cohort [2] provides background only and was not a concurrent control group.</w:t>
       </w:r>
     </w:p>
     <w:p>
@@ -202,7 +202,7 @@
     </w:p>
     <w:p>
       <w:r>
-        <w:t>The archived Stage-3 build is identified as Alpine_Coordination_Game_Stage3_v2.2.html, a 37,279-byte HTML file with SHA-256 prefix 42bc3df6; the archive identifies it as byte-identical to the _v2 file. Runs use a distance goal or a time cap: 200 m or 30 seconds, and 400 m or 60 seconds. The build's zero-failure mode does not slow the player following a bump. It supports keyboard arrows and a joystick or foot pad through the browser Gamepad API. The archived version lacks touch controls; the authors report that tablet-assisted sessions used an external keyboard with this same build, and that the invitation's mention of touchscreen play did not correspond to a touch-capable version, which was first created in August 2026. Figure 1 illustrates the archived design at staged difficulty settings.</w:t>
+        <w:t>The archived Stage-3 build is identified as Alpine_Coordination_Game_Stage3_v2.2.html, a 37,279-byte HTML file with SHA-256 prefix 42bc3df6; the archive identifies it as byte-identical to the _v2 file. Runs use a distance goal or a time cap: 200 m or 30 seconds, and 400 m or 60 seconds. The build's zero-failure mode does not slow the player following a bump. It supports keyboard arrows and a joystick or foot pad through the browser Gamepad API; keyboard or foot-pad control was retained in Stage 3A to keep the control demands closer to the Stage-2 station, and touch input was reserved for the later Stage-3B design because most of the intended Stage-3B players had already played the Stage-3A keyboard version. The archived version lacks touch controls; the authors report that tablet-assisted sessions used an external keyboard with this same build, and that the invitation's mention of touchscreen play did not correspond to a touch-capable version, which was first created in August 2026. Figure 1 illustrates the archived design at staged difficulty settings.</w:t>
       </w:r>
     </w:p>
     <w:p>
@@ -2988,7 +2988,7 @@
     </w:p>
     <w:p>
       <w:r>
-        <w:t>The study describes the transfer of a game from an FRA station to a non-clinical browser deployment and the associated aggregate engagement record. Initial-dropout labels were concentrated in the older bands, and most initial-dropout records also carried a returned label. The applied classification rule and event timing cannot be reconstructed from the aggregate summary. The figures therefore do not demonstrate sustained retention, voluntary re-engagement after a defined failure, or a benefit from clinical decoupling. The implementation provides a case for examining which aspects of presentation, task demands and support should be measured in a subsequent evaluation.</w:t>
+        <w:t>The study describes the transfer of a game from an FRA station to a non-clinical browser deployment and the associated aggregate engagement record. Initial-dropout labels were concentrated in the older bands, and most initial-dropout records also carried a returned label. The applied classification rule and event timing cannot be reconstructed from the aggregate summary. The figures therefore do not demonstrate sustained retention, voluntary re-engagement after a defined failure, or a benefit from clinical decoupling. The implementation provides a case for examining which aspects of presentation, task demands and support should be measured in a subsequent evaluation. The programme's preferred reading is that the earlier abandonment was a self-appraisal response to failure attached to an assessment of one's own body, rather than a shortcoming of game design or of technology acceptance; the present record is consistent with that reading but cannot separate it from the competing explanations in the following subsection.</w:t>
       </w:r>
     </w:p>
     <w:p>
@@ -3051,6 +3051,11 @@
       </w:r>
     </w:p>
     <w:p>
+      <w:r>
+        <w:t>The design direction behind Stage 3B can be stated without its results. When the game was attached to the FRA, its purpose was to measure performance; in the decoupled Stage-3A deployment that measurement was unavailable, and the programme defines the target of the redesign as learning from the experience of play rather than a single score. Stage 3B therefore kept the aesthetic of the Stage-3A game and varied the mechanism, with an adaptive presentation produced through AI-assisted development set against a static one and a zero-failure mode against a game-over mode, to see whether different designs produced different performance. The record was too small and too confounded to interpret, so whether adaptive learning can be realised in AI-designed game mechanisms is carried as future research and is documented in the first author's thesis.</w:t>
+      </w:r>
+    </w:p>
+    <w:p>
       <w:pPr>
         <w:pStyle w:val="Heading2"/>
       </w:pPr>
@@ -3109,7 +3114,7 @@
     </w:p>
     <w:p>
       <w:r>
-        <w:t>The authors thank the network partners and participants who supported distribution and collection. Supervision by Prof. Chi Fai Cheung at The Hong Kong Polytechnic University is gratefully acknowledged.</w:t>
+        <w:t>The authors thank the research assistants who distributed the game and assisted older participants with device operation, the network partners, and the participants who returned their game records and questionnaire responses; the assistants do not meet authorship criteria. Supervision by Prof. Chi Fai Cheung at The Hong Kong Polytechnic University is gratefully acknowledged.</w:t>
       </w:r>
     </w:p>
     <w:p>

</xml_diff>

<commit_message>
Paper 3 R7 and thesis V45: recruitment target (20 distributors x ~10 players), no prior play in Stage 3A, prior-play screen in Stage 3B; touch rationale corrected
Co-Authored-By: Claude Fable 5.1 <noreply@anthropic.com>
Claude-Session: https://claude.ai/code/session_01KoT3i8geZspYBMMKVYJUTG
</commit_message>
<xml_diff>
--- a/docs/papers/paper3_submission/jmir_R7/Paper3_R7_JMIR_Manuscript_2026-09-27.docx
+++ b/docs/papers/paper3_submission/jmir_R7/Paper3_R7_JMIR_Manuscript_2026-09-27.docx
@@ -166,7 +166,7 @@
     </w:p>
     <w:p>
       <w:r>
-        <w:t>The compiled record contains 120 adults aged 25-80 years: 38 aged 25-44, 41 aged 45-64 and 41 aged 65-80; 48 were recorded as men and 72 as women, and all were recorded as having high-school education or above. Enrolment information was limited to age band, gender and education. Distributor briefs addressed players aged 45 and over and players aged 18-45. The analysed denominator comprises returned materials included in the aggregate summary. The number invited, the number receiving a forwarded invitation and the number beginning gameplay without returning a file were not compiled. Consequently, a recruitment response rate or population-wide retention rate cannot be estimated.</w:t>
+        <w:t>The compiled record contains 120 adults aged 25-80 years: 38 aged 25-44, 41 aged 45-64 and 41 aged 65-80; 48 were recorded as men and 72 as women, and all were recorded as having high-school education or above. Enrolment information was limited to age band, gender and education. Distributor briefs addressed players aged 45 and over and players aged 18-45. The analysed denominator comprises returned materials included in the aggregate summary. Twenty distributors were invited and each was asked to find about ten players across the age bands; how many people they actually invited was not recorded, and 120 results files were received. The number receiving an invitation and the number beginning gameplay without returning a file were therefore not compiled. Consequently, a recruitment response rate or population-wide retention rate cannot be estimated.</w:t>
       </w:r>
     </w:p>
     <w:p>
@@ -202,7 +202,7 @@
     </w:p>
     <w:p>
       <w:r>
-        <w:t>The archived Stage-3 build is identified as Alpine_Coordination_Game_Stage3_v2.2.html, a 37,279-byte HTML file with SHA-256 prefix 42bc3df6; the archive identifies it as byte-identical to the _v2 file. Runs use a distance goal or a time cap: 200 m or 30 seconds, and 400 m or 60 seconds. The build's zero-failure mode does not slow the player following a bump. It supports keyboard arrows and a joystick or foot pad through the browser Gamepad API; keyboard or foot-pad control was retained in Stage 3A to keep the control demands closer to the Stage-2 station, and touch input was reserved for the later Stage-3B design because most of the intended Stage-3B players had already played the Stage-3A keyboard version. The archived version lacks touch controls; the authors report that tablet-assisted sessions used an external keyboard with this same build, and that the invitation's mention of touchscreen play did not correspond to a touch-capable version, which was first created in August 2026. Figure 1 illustrates the archived design at staged difficulty settings.</w:t>
+        <w:t>The archived Stage-3 build is identified as Alpine_Coordination_Game_Stage3_v2.2.html, a 37,279-byte HTML file with SHA-256 prefix 42bc3df6; the archive identifies it as byte-identical to the _v2 file. Runs use a distance goal or a time cap: 200 m or 30 seconds, and 400 m or 60 seconds. The build's zero-failure mode does not slow the player following a bump. It supports keyboard arrows and a joystick or foot pad through the browser Gamepad API; keyboard or foot-pad control was retained in Stage 3A to keep the control demands closer to the Stage-2 station, and touch input was introduced only in the later Stage-3B design. No Stage-3A participant had played the game before; because some Stage-3B players had played the Stage-3A game, the Stage-3B build asks each player whether they have played before. The archived version lacks touch controls; the authors report that tablet-assisted sessions used an external keyboard with this same build, and that the invitation's mention of touchscreen play did not correspond to a touch-capable version, which was first created in August 2026. Figure 1 illustrates the archived design at staged difficulty settings.</w:t>
       </w:r>
     </w:p>
     <w:p>

</xml_diff>

<commit_message>
Paper 3 R7 Conclusions and thesis V45 §9.12: author's closing contribution statement (self-appraisal role; Stage-3B design as implemented means of investigating learning; future research)
Co-Authored-By: Claude Fable 5.1 <noreply@anthropic.com>
Claude-Session: https://claude.ai/code/session_01KoT3i8geZspYBMMKVYJUTG
</commit_message>
<xml_diff>
--- a/docs/papers/paper3_submission/jmir_R7/Paper3_R7_JMIR_Manuscript_2026-09-27.docx
+++ b/docs/papers/paper3_submission/jmir_R7/Paper3_R7_JMIR_Manuscript_2026-09-27.docx
@@ -3101,7 +3101,17 @@
     </w:p>
     <w:p>
       <w:r>
-        <w:t>A compiled record of a non-clinical coordination-game deployment contains age-related differences in initial-dropout classifications and returned labels for most records classified as initial dropouts. The applied rules, event timing and questionnaire instrument remain insufficiently documented for stronger behavioural conclusions. The record does not establish that removing clinical apparatus reduced abandonment. Its current value is in describing the redesign and the specific evidence needed to evaluate engagement reproducibly.</w:t>
+        <w:t>This exploratory study developed a coordination-game approach decoupled from clinical fall risk assessment to investigate engagement and the proposed role of self-appraisal in failure-induced abandonment. Stage 3A described age differences in compiled engagement classifications, providing observations that motivate further investigation of FIAS. These findings do not establish a distinct psychological mechanism or a causal effect of decoupling.</w:t>
+      </w:r>
+    </w:p>
+    <w:p>
+      <w:r>
+        <w:t>Stage 3B extended this work through a design incorporating practice, fixed-course performance checks, players' own post-game feedback and subsequent adaptation of game settings through local rules; its implementation is documented in the first author's thesis, and durable learning was not evaluated. The study therefore contributes an exploratory account of engagement and an implemented design for investigating learning from gameplay experience. Future research should test the self-appraisal hypothesis and the effects of adaptation using verified participant linkage, comparable assessments, appropriate comparison conditions and delayed retention or transfer measures.</w:t>
+      </w:r>
+    </w:p>
+    <w:p>
+      <w:r>
+        <w:t>The applied classification rules, event timing and questionnaire instrument remain insufficiently documented for stronger behavioural conclusions, and the record does not establish that removing clinical apparatus reduced abandonment; its present value lies in describing the redesign and the specific evidence a reproducible evaluation of engagement requires.</w:t>
       </w:r>
     </w:p>
     <w:p>

</xml_diff>